<commit_message>
Add supplied full texts, searchable TXT library, and Claude handoff
</commit_message>
<xml_diff>
--- a/outputs/研究计划_完善版.docx
+++ b/outputs/研究计划_完善版.docx
@@ -2,7 +2,7 @@
 <file path=word/document.xml><?xml version="1.0" encoding="utf-8"?>
 <w:document xmlns:w="http://schemas.openxmlformats.org/wordprocessingml/2006/main" xmlns:m="http://schemas.openxmlformats.org/officeDocument/2006/math" xmlns:r="http://schemas.openxmlformats.org/officeDocument/2006/relationships" xmlns:o="urn:schemas-microsoft-com:office:office" xmlns:v="urn:schemas-microsoft-com:vml" xmlns:w10="urn:schemas-microsoft-com:office:word" xmlns:a="http://schemas.openxmlformats.org/drawingml/2006/main" xmlns:pic="http://schemas.openxmlformats.org/drawingml/2006/picture" xmlns:wp="http://schemas.openxmlformats.org/drawingml/2006/wordprocessingDrawing">
   <w:body>
-    <w:bookmarkStart w:id="88" w:name="超越原始特征的加性解释跨语言兄弟姐妹称谓共享词形的语义组合研究"/>
+    <w:bookmarkStart w:id="86" w:name="超越原始特征的加性解释跨语言兄弟姐妹称谓共享词形的语义组合研究"/>
     <w:p>
       <w:pPr>
         <w:pStyle w:val="Heading1"/>
@@ -20,7 +20,7 @@
           <w:b/>
           <w:bCs/>
         </w:rPr>
-        <w:t xml:space="preserve">研究计划完善版｜2026年10月14日</w:t>
+        <w:t xml:space="preserve">研究计划完善版｜2026年10月15日文献修订</w:t>
       </w:r>
       <w:r>
         <w:br/>
@@ -85,7 +85,7 @@
         <w:pStyle w:val="BodyText"/>
       </w:pPr>
       <w:r>
-        <w:t xml:space="preserve">完成标准为：实质性相关的可核验文献不少于40份；每项关键论断可追溯至所读全文或摘要；尽量保存PDF，并逐项记录未获得PDF的资料；数据、代码、版本、冻结协议和实测结果齐全；计划与论文用中文撰写。</w:t>
+        <w:t xml:space="preserve">完成标准为：实质性相关的可核验文献不少于40份；每项正式引用可追溯至已取得的全文；未取得全文的文献从引用中排除并单列；数据、代码、版本、冻结协议和实测结果齐全；计划与论文用中文撰写。</w:t>
       </w:r>
     </w:p>
     <w:bookmarkEnd w:id="20"/>
@@ -348,7 +348,7 @@
         <w:pStyle w:val="BodyText"/>
       </w:pPr>
       <w:r>
-        <w:t xml:space="preserve">全文、HTML全文、仅摘要与仅书目分别记录。摘要资料用于其实际报告的研究目标与总体发现，详细方法、效应量和页码采用已取得全文的证据。资料库按经典亲属研究、语义范畴与效率研究、统计与数据方法分组；书目与注释另见《文献综述与证据台账》。</w:t>
+        <w:t xml:space="preserve">正式引用只纳入已取得全文的文献，当前46项均有PDF和逐页TXT。保留的作者稿、正式版和历史版本分别标识；未取得全文者仅进入排除记录，不进入论证和参考文献。资料库按经典亲属研究、语义范畴与效率研究、统计与数据方法分组；书目与注释另见《文献综述与证据台账》。</w:t>
       </w:r>
     </w:p>
     <w:bookmarkEnd w:id="21"/>
@@ -461,7 +461,7 @@
               <w:jc w:val="left"/>
             </w:pPr>
             <w:r>
-              <w:t xml:space="preserve">经典亲属文献组A；Nerlove与Romney、Kronenfeld</w:t>
+              <w:t xml:space="preserve">Kroeber与Kronenfeld全文[A01、A06]</w:t>
             </w:r>
           </w:p>
         </w:tc>
@@ -1053,7 +1053,7 @@
         <w:pStyle w:val="FirstParagraph"/>
       </w:pPr>
       <w:r>
-        <w:t xml:space="preserve">早期亲属研究提供了比较不同称谓体系的参照关系和分类维度。Kroeber对称谓区分的讨论、Goodenough和Lounsbury的成分分析，将亲属词汇与可组合的语义属性连接起来。Morgan的历史材料则构成后来数据库资料的重要来源。应区分“用多个属性描述词义”和“统计模型中各属性对词形共享的作用相加”：前者并不自动包含后者。</w:t>
+        <w:t xml:space="preserve">早期亲属研究提供了比较不同称谓体系的参照关系和分类维度。Kroeber对称谓区分的讨论，以及Goodenough和Lounsbury的成分分析，将亲属词汇与可组合的语义属性连接起来[A01、A03、A04]。Goodenough比较能够描述相同亲属用法的不同概念模型；Lounsbury区分显性和隐性的语义特征表达。这两项全文为区分语义表述、词形与模型编码提供了直接依据。Morgan的历史材料则构成后来数据库资料的重要来源。应区分“用多个属性描述词义”和“统计模型中各属性对词形共享的作用相加”：前者并不自动包含后者。</w:t>
       </w:r>
     </w:p>
     <w:p>
@@ -1061,7 +1061,7 @@
         <w:pStyle w:val="BodyText"/>
       </w:pPr>
       <w:r>
-        <w:t xml:space="preserve">Kinbank原文[A09]介绍Nerlove与Romney框架时，以所指者性别、参照者性别、相对年龄组织八种兄弟姐妹位置；Nerlove与Romney的原摘要[A02]报告同性／异性区分与跨性别关系。Kronenfeld进一步讨论类型空间、合取结构和标记性。因此，三维类别空间和同性／异性称谓都应作为已有理论基础。相关规则有助于判断回归中的组合项究竟是传统区分的重述，还是具有额外解释量的结构。</w:t>
+        <w:t xml:space="preserve">Kronenfeld的全文[A06，第490—491页]以所指者性别、参照者性别、相对年龄组织八种兄弟姐妹位置，另将比较两性别所得的相对性别列为语义特征，并修订合取性、标记性和层级条件。其Fanti讨论进一步显示词项覆盖可以重叠，而未必形成每个关系位置只归于一个词项的整齐划分[第501页]。Faris的Nuba材料则说明某些同性／异性区分依说话者性别而变化，并通过多义分析重新讨论表面析取[A20，第483—484页]。因此，三维类别空间和同性／异性称谓都应作为已有理论基础。相关规则有助于判断回归中的组合项究竟是传统区分的重述，还是具有额外解释量的结构。</w:t>
       </w:r>
     </w:p>
     <w:bookmarkEnd w:id="26"/>
@@ -3451,19 +3451,19 @@
               <w:jc w:val="left"/>
             </w:pPr>
             <w:r>
-              <w:t xml:space="preserve">检索经典与最新成果，全文／摘要阅读，核验版本与书目，建立下载清单</w:t>
-            </w:r>
-          </w:p>
-        </w:tc>
-        <w:tc>
-          <w:tcPr/>
-          <w:p>
-            <w:pPr>
-              <w:pStyle w:val="Compact"/>
-              <w:jc w:val="left"/>
-            </w:pPr>
-            <w:r>
-              <w:t xml:space="preserve">不少于40份实质性文献；引用、状态与下载日志</w:t>
+              <w:t xml:space="preserve">检索经典与最新成果，全文定向阅读，核验版本与书目，建立排除和转换清单</w:t>
+            </w:r>
+          </w:p>
+        </w:tc>
+        <w:tc>
+          <w:tcPr/>
+          <w:p>
+            <w:pPr>
+              <w:pStyle w:val="Compact"/>
+              <w:jc w:val="left"/>
+            </w:pPr>
+            <w:r>
+              <w:t xml:space="preserve">不少于40项全文文献；引用、PDF／TXT、版本与排除记录</w:t>
             </w:r>
           </w:p>
         </w:tc>
@@ -3662,7 +3662,7 @@
         <w:pStyle w:val="FirstParagraph"/>
       </w:pPr>
       <w:r>
-        <w:t xml:space="preserve">本次已完成45份正式可计入的文献阅读，其中40份取得PDF全文（含作者稿、预印稿或对应工作论文），5份取得真实摘要；另保存2份历史首段预览和1份仅书目资料，不将其计入45份。文献下载状态和版本差异均有记录。</w:t>
+        <w:t xml:space="preserve">2026年10月15日收到用户补充的8份PDF，现正式引用46项有全文的独立文献，每项有PDF和TXT。2项仍无全文的资料只保留在排除表。主文献之外的历史版本和补充材料不重复计数；全文转换、页码和OCR质量另有记录。</w:t>
       </w:r>
     </w:p>
     <w:p>
@@ -3673,8 +3673,16 @@
         <w:t xml:space="preserve">数据协议在共享结果生成前固定；实际主分析包含939个完整语言记录系统、125个谱系组、26,292个类别对，全部135次拟合收敛。主设定完整交互相对原始加性增益0.004423，95%谱系区间[-0.000510, 0.008205]；相对经典加性增益0.001843，区间[-0.000604, 0.006120]。全部预设变体及独立复算已完成，结果见中文论文和执行报告。</w:t>
       </w:r>
     </w:p>
+    <w:p>
+      <w:pPr>
+        <w:pStyle w:val="BodyText"/>
+      </w:pPr>
+      <w:r>
+        <w:t xml:space="preserve">本轮修订更新全文依据和文件组织；2026年10月14日冻结并执行的数据、主比较及预设敏感性数值保持原记录。新文献提出的进一步理论核查和模型扩展见Claude待完成清单。</w:t>
+      </w:r>
+    </w:p>
     <w:bookmarkEnd w:id="38"/>
-    <w:bookmarkStart w:id="87" w:name="参考文献"/>
+    <w:bookmarkStart w:id="85" w:name="参考文献"/>
     <w:p>
       <w:pPr>
         <w:pStyle w:val="Heading2"/>
@@ -3688,7 +3696,7 @@
         <w:pStyle w:val="FirstParagraph"/>
       </w:pPr>
       <w:r>
-        <w:t xml:space="preserve">完整书目及每项资料的获取状态将在下列统一文献表列出。原文题名、作者、DOI保持原语，说明文字采用中文。</w:t>
+        <w:t xml:space="preserve">当前正式参考文献仅包含已取得全文的46项独立著作，编号与登记表一致。</w:t>
       </w:r>
     </w:p>
     <w:p>
@@ -3731,7 +3739,7 @@
         <w:pStyle w:val="BodyText"/>
       </w:pPr>
       <w:r>
-        <w:t xml:space="preserve">[A02] Sara Nerlove, A. Kimball Romney（1967）.</w:t>
+        <w:t xml:space="preserve">[A03] Ward H. Goodenough（1956）.</w:t>
       </w:r>
       <w:r>
         <w:t xml:space="preserve"> </w:t>
@@ -3741,10 +3749,10 @@
           <w:i/>
           <w:iCs/>
         </w:rPr>
-        <w:t xml:space="preserve">Sibling Terminology and Cross-Sex Behavior</w:t>
-      </w:r>
-      <w:r>
-        <w:t xml:space="preserve">. American Anthropologist, 69(2), 179-187.</w:t>
+        <w:t xml:space="preserve">Componential Analysis and the Study of Meaning</w:t>
+      </w:r>
+      <w:r>
+        <w:t xml:space="preserve">. Language, 32(1), 195-216.</w:t>
       </w:r>
       <w:r>
         <w:t xml:space="preserve"> </w:t>
@@ -3766,7 +3774,7 @@
         <w:pStyle w:val="BodyText"/>
       </w:pPr>
       <w:r>
-        <w:t xml:space="preserve">[A06] David B. Kronenfeld（1974）.</w:t>
+        <w:t xml:space="preserve">[A04] Floyd G. Lounsbury（1956）.</w:t>
       </w:r>
       <w:r>
         <w:t xml:space="preserve"> </w:t>
@@ -3776,10 +3784,10 @@
           <w:i/>
           <w:iCs/>
         </w:rPr>
-        <w:t xml:space="preserve">Sibling Typology: Beyond Nerlove and Romney</w:t>
-      </w:r>
-      <w:r>
-        <w:t xml:space="preserve">. American Ethnologist, 1(3), 489-506.</w:t>
+        <w:t xml:space="preserve">A Semantic Analysis of the Pawnee Kinship Usage</w:t>
+      </w:r>
+      <w:r>
+        <w:t xml:space="preserve">. Language, 32(1), 158-194.</w:t>
       </w:r>
       <w:r>
         <w:t xml:space="preserve"> </w:t>
@@ -3801,7 +3809,7 @@
         <w:pStyle w:val="BodyText"/>
       </w:pPr>
       <w:r>
-        <w:t xml:space="preserve">[A07] Per Hage（2001）.</w:t>
+        <w:t xml:space="preserve">[A06] David B. Kronenfeld（1974）.</w:t>
       </w:r>
       <w:r>
         <w:t xml:space="preserve"> </w:t>
@@ -3811,10 +3819,10 @@
           <w:i/>
           <w:iCs/>
         </w:rPr>
-        <w:t xml:space="preserve">Marking Theory and Kinship Analysis: Cross-cultural and Historical Applications</w:t>
-      </w:r>
-      <w:r>
-        <w:t xml:space="preserve">. Anthropological Theory, 1(2), 197-211.</w:t>
+        <w:t xml:space="preserve">Sibling Typology: Beyond Nerlove and Romney</w:t>
+      </w:r>
+      <w:r>
+        <w:t xml:space="preserve">. American Ethnologist, 1(3), 489-506.</w:t>
       </w:r>
       <w:r>
         <w:t xml:space="preserve"> </w:t>
@@ -3836,7 +3844,7 @@
         <w:pStyle w:val="BodyText"/>
       </w:pPr>
       <w:r>
-        <w:t xml:space="preserve">[A08] Lewis Henry Morgan（1871）.</w:t>
+        <w:t xml:space="preserve">[A07] Per Hage（2001）.</w:t>
       </w:r>
       <w:r>
         <w:t xml:space="preserve"> </w:t>
@@ -3846,10 +3854,10 @@
           <w:i/>
           <w:iCs/>
         </w:rPr>
-        <w:t xml:space="preserve">Systems of Consanguinity and Affinity of the Human Family</w:t>
-      </w:r>
-      <w:r>
-        <w:t xml:space="preserve">. Smithsonian Contributions to Knowledge, Vol. 17, Smithsonian Institution.</w:t>
+        <w:t xml:space="preserve">Marking Theory and Kinship Analysis: Cross-cultural and Historical Applications</w:t>
+      </w:r>
+      <w:r>
+        <w:t xml:space="preserve">. Anthropological Theory, 1(2), 197-211.</w:t>
       </w:r>
       <w:r>
         <w:t xml:space="preserve"> </w:t>
@@ -3871,7 +3879,7 @@
         <w:pStyle w:val="BodyText"/>
       </w:pPr>
       <w:r>
-        <w:t xml:space="preserve">[A09] Sam Passmore, Wolfgang Barth, Simon J. Greenhill, Kyla Quinn, Catherine Sheard, Paraskevi Argyriou, Joshua Birchall, Claire Bowern, Jasmine Calladine, Angarika Deb, Anouk Diederen, Niklas P. Metsäranta, Luis Henrique Araujo, Rhiannon Schembri, Jo Hickey-Hall, Terhi Honkola, Alice Mitchell, Lucy Poole, Péter M. Rácz, Sean G. Roberts, Robert M. Ross, Ewan Thomas-Colquhoun, Nicholas Evans, Fiona M. Jordan（2023）.</w:t>
+        <w:t xml:space="preserve">[A08] Lewis Henry Morgan（1871）.</w:t>
       </w:r>
       <w:r>
         <w:t xml:space="preserve"> </w:t>
@@ -3881,10 +3889,10 @@
           <w:i/>
           <w:iCs/>
         </w:rPr>
-        <w:t xml:space="preserve">Kinbank: A Global Database of Kinship Terminology</w:t>
-      </w:r>
-      <w:r>
-        <w:t xml:space="preserve">. PLOS ONE, 18(5), e0283218.</w:t>
+        <w:t xml:space="preserve">Systems of Consanguinity and Affinity of the Human Family</w:t>
+      </w:r>
+      <w:r>
+        <w:t xml:space="preserve">. Smithsonian Contributions to Knowledge, Vol. 17, Smithsonian Institution.</w:t>
       </w:r>
       <w:r>
         <w:t xml:space="preserve"> </w:t>
@@ -3906,7 +3914,7 @@
         <w:pStyle w:val="BodyText"/>
       </w:pPr>
       <w:r>
-        <w:t xml:space="preserve">[A10] Fiona M. Jordan（2011）.</w:t>
+        <w:t xml:space="preserve">[A09] Sam Passmore, Wolfgang Barth, Simon J. Greenhill, Kyla Quinn, Catherine Sheard, Paraskevi Argyriou, Joshua Birchall, Claire Bowern, Jasmine Calladine, Angarika Deb, Anouk Diederen, Niklas P. Metsäranta, Luis Henrique Araujo, Rhiannon Schembri, Jo Hickey-Hall, Terhi Honkola, Alice Mitchell, Lucy Poole, Péter M. Rácz, Sean G. Roberts, Robert M. Ross, Ewan Thomas-Colquhoun, Nicholas Evans, Fiona M. Jordan（2023）.</w:t>
       </w:r>
       <w:r>
         <w:t xml:space="preserve"> </w:t>
@@ -3916,10 +3924,10 @@
           <w:i/>
           <w:iCs/>
         </w:rPr>
-        <w:t xml:space="preserve">A Phylogenetic Analysis of the Evolution of Austronesian Sibling Terminologies</w:t>
-      </w:r>
-      <w:r>
-        <w:t xml:space="preserve">. Human Biology, 83(2), 297-321.</w:t>
+        <w:t xml:space="preserve">Kinbank: A Global Database of Kinship Terminology</w:t>
+      </w:r>
+      <w:r>
+        <w:t xml:space="preserve">. PLOS ONE, 18(5), e0283218.</w:t>
       </w:r>
       <w:r>
         <w:t xml:space="preserve"> </w:t>
@@ -3941,7 +3949,7 @@
         <w:pStyle w:val="BodyText"/>
       </w:pPr>
       <w:r>
-        <w:t xml:space="preserve">[A11] Sam Passmore, Fiona M. Jordan（2020）.</w:t>
+        <w:t xml:space="preserve">[A10] Fiona M. Jordan（2011）.</w:t>
       </w:r>
       <w:r>
         <w:t xml:space="preserve"> </w:t>
@@ -3951,10 +3959,10 @@
           <w:i/>
           <w:iCs/>
         </w:rPr>
-        <w:t xml:space="preserve">No Universals in the Cultural Evolution of Kinship Terminology</w:t>
-      </w:r>
-      <w:r>
-        <w:t xml:space="preserve">. Evolutionary Human Sciences, 2.</w:t>
+        <w:t xml:space="preserve">A Phylogenetic Analysis of the Evolution of Austronesian Sibling Terminologies</w:t>
+      </w:r>
+      <w:r>
+        <w:t xml:space="preserve">. Human Biology, 83(2), 297-321.</w:t>
       </w:r>
       <w:r>
         <w:t xml:space="preserve"> </w:t>
@@ -3976,7 +3984,7 @@
         <w:pStyle w:val="BodyText"/>
       </w:pPr>
       <w:r>
-        <w:t xml:space="preserve">[A12] Péter Rácz, Sam Passmore, Fiona M. Jordan（2020）.</w:t>
+        <w:t xml:space="preserve">[A11] Sam Passmore, Fiona M. Jordan（2020）.</w:t>
       </w:r>
       <w:r>
         <w:t xml:space="preserve"> </w:t>
@@ -3986,10 +3994,10 @@
           <w:i/>
           <w:iCs/>
         </w:rPr>
-        <w:t xml:space="preserve">Social Practice and Shared History, Not Social Scale, Structure Cross-Cultural Complexity in Kinship Systems</w:t>
-      </w:r>
-      <w:r>
-        <w:t xml:space="preserve">. Topics in Cognitive Science, 12(2), 744–765.</w:t>
+        <w:t xml:space="preserve">No Universals in the Cultural Evolution of Kinship Terminology</w:t>
+      </w:r>
+      <w:r>
+        <w:t xml:space="preserve">. Evolutionary Human Sciences, 2.</w:t>
       </w:r>
       <w:r>
         <w:t xml:space="preserve"> </w:t>
@@ -4011,7 +4019,7 @@
         <w:pStyle w:val="BodyText"/>
       </w:pPr>
       <w:r>
-        <w:t xml:space="preserve">[A13] Myrtille Guillon, Ruth Mace（2016）.</w:t>
+        <w:t xml:space="preserve">[A12] Péter Rácz, Sam Passmore, Fiona M. Jordan（2020）.</w:t>
       </w:r>
       <w:r>
         <w:t xml:space="preserve"> </w:t>
@@ -4021,10 +4029,10 @@
           <w:i/>
           <w:iCs/>
         </w:rPr>
-        <w:t xml:space="preserve">A Phylogenetic Comparative Study of Bantu Kinship Terminology Finds Limited Support for Its Co-Evolution with Social Organisation</w:t>
-      </w:r>
-      <w:r>
-        <w:t xml:space="preserve">. PLOS ONE, 11(3), e0147920.</w:t>
+        <w:t xml:space="preserve">Social Practice and Shared History, Not Social Scale, Structure Cross-Cultural Complexity in Kinship Systems</w:t>
+      </w:r>
+      <w:r>
+        <w:t xml:space="preserve">. Topics in Cognitive Science, 12(2), 744–765.</w:t>
       </w:r>
       <w:r>
         <w:t xml:space="preserve"> </w:t>
@@ -4046,7 +4054,7 @@
         <w:pStyle w:val="BodyText"/>
       </w:pPr>
       <w:r>
-        <w:t xml:space="preserve">[A14] Doug Jones（2010）.</w:t>
+        <w:t xml:space="preserve">[A13] Myrtille Guillon, Ruth Mace（2016）.</w:t>
       </w:r>
       <w:r>
         <w:t xml:space="preserve"> </w:t>
@@ -4056,10 +4064,10 @@
           <w:i/>
           <w:iCs/>
         </w:rPr>
-        <w:t xml:space="preserve">Human Kinship, from Conceptual Structure to Grammar</w:t>
-      </w:r>
-      <w:r>
-        <w:t xml:space="preserve">. Behavioral and Brain Sciences, 33(5), 367-381.</w:t>
+        <w:t xml:space="preserve">A Phylogenetic Comparative Study of Bantu Kinship Terminology Finds Limited Support for Its Co-Evolution with Social Organisation</w:t>
+      </w:r>
+      <w:r>
+        <w:t xml:space="preserve">. PLOS ONE, 11(3), e0147920.</w:t>
       </w:r>
       <w:r>
         <w:t xml:space="preserve"> </w:t>
@@ -4081,7 +4089,7 @@
         <w:pStyle w:val="BodyText"/>
       </w:pPr>
       <w:r>
-        <w:t xml:space="preserve">[A15] Dwight W. Read（2007）.</w:t>
+        <w:t xml:space="preserve">[A14] Doug Jones（2010）.</w:t>
       </w:r>
       <w:r>
         <w:t xml:space="preserve"> </w:t>
@@ -4091,10 +4099,10 @@
           <w:i/>
           <w:iCs/>
         </w:rPr>
-        <w:t xml:space="preserve">Kinship Theory: A Paradigm Shift</w:t>
-      </w:r>
-      <w:r>
-        <w:t xml:space="preserve">. Ethnology, 46(4), 329–364.</w:t>
+        <w:t xml:space="preserve">Human Kinship, from Conceptual Structure to Grammar</w:t>
+      </w:r>
+      <w:r>
+        <w:t xml:space="preserve">. Behavioral and Brain Sciences, 33(5), 367-381.</w:t>
       </w:r>
       <w:r>
         <w:t xml:space="preserve"> </w:t>
@@ -4116,7 +4124,7 @@
         <w:pStyle w:val="BodyText"/>
       </w:pPr>
       <w:r>
-        <w:t xml:space="preserve">[A16] Vladimir Pericliev（2017）.</w:t>
+        <w:t xml:space="preserve">[A15] Dwight W. Read（2007）.</w:t>
       </w:r>
       <w:r>
         <w:t xml:space="preserve"> </w:t>
@@ -4126,10 +4134,10 @@
           <w:i/>
           <w:iCs/>
         </w:rPr>
-        <w:t xml:space="preserve">Kin Term Patterns and Language Families</w:t>
-      </w:r>
-      <w:r>
-        <w:t xml:space="preserve">. Cognitive Studies | Études cognitives(17).</w:t>
+        <w:t xml:space="preserve">Kinship Theory: A Paradigm Shift</w:t>
+      </w:r>
+      <w:r>
+        <w:t xml:space="preserve">. Ethnology, 46(4), 329–364.</w:t>
       </w:r>
       <w:r>
         <w:t xml:space="preserve"> </w:t>
@@ -4151,7 +4159,7 @@
         <w:pStyle w:val="BodyText"/>
       </w:pPr>
       <w:r>
-        <w:t xml:space="preserve">[A17] David B. Kronenfeld（2006）.</w:t>
+        <w:t xml:space="preserve">[A16] Vladimir Pericliev（2017）.</w:t>
       </w:r>
       <w:r>
         <w:t xml:space="preserve"> </w:t>
@@ -4161,10 +4169,10 @@
           <w:i/>
           <w:iCs/>
         </w:rPr>
-        <w:t xml:space="preserve">Issues in the Classification of Kinship Terminologies: Toward a New Typology</w:t>
-      </w:r>
-      <w:r>
-        <w:t xml:space="preserve">. Anthropos, 101(1), 203–219.</w:t>
+        <w:t xml:space="preserve">Kin Term Patterns and Language Families</w:t>
+      </w:r>
+      <w:r>
+        <w:t xml:space="preserve">. Cognitive Studies | Études cognitives(17).</w:t>
       </w:r>
       <w:r>
         <w:t xml:space="preserve"> </w:t>
@@ -4186,7 +4194,7 @@
         <w:pStyle w:val="BodyText"/>
       </w:pPr>
       <w:r>
-        <w:t xml:space="preserve">[A18] Sam Passmore, Wolfgang Barth, Kyla Quinn, Simon J. Greenhill, Nicholas Evans, Fiona M. Jordan（2021）.</w:t>
+        <w:t xml:space="preserve">[A17] David B. Kronenfeld（2006）.</w:t>
       </w:r>
       <w:r>
         <w:t xml:space="preserve"> </w:t>
@@ -4196,10 +4204,10 @@
           <w:i/>
           <w:iCs/>
         </w:rPr>
-        <w:t xml:space="preserve">Kin Against Kin: Internal Co-selection and the Coherence of Kinship Typologies</w:t>
-      </w:r>
-      <w:r>
-        <w:t xml:space="preserve">. Biological Theory, 16(3), 176-193.</w:t>
+        <w:t xml:space="preserve">Issues in the Classification of Kinship Terminologies: Toward a New Typology</w:t>
+      </w:r>
+      <w:r>
+        <w:t xml:space="preserve">. Anthropos, 101(1), 203–219.</w:t>
       </w:r>
       <w:r>
         <w:t xml:space="preserve"> </w:t>
@@ -4221,7 +4229,7 @@
         <w:pStyle w:val="BodyText"/>
       </w:pPr>
       <w:r>
-        <w:t xml:space="preserve">[A19] Per Hage（1997）.</w:t>
+        <w:t xml:space="preserve">[A18] Sam Passmore, Wolfgang Barth, Kyla Quinn, Simon J. Greenhill, Nicholas Evans, Fiona M. Jordan（2021）.</w:t>
       </w:r>
       <w:r>
         <w:t xml:space="preserve"> </w:t>
@@ -4231,10 +4239,10 @@
           <w:i/>
           <w:iCs/>
         </w:rPr>
-        <w:t xml:space="preserve">Unthinkable Categories and the Fundamental Laws of Kinship</w:t>
-      </w:r>
-      <w:r>
-        <w:t xml:space="preserve">. American Ethnologist, 24(3), 652-667.</w:t>
+        <w:t xml:space="preserve">Kin Against Kin: Internal Co-selection and the Coherence of Kinship Typologies</w:t>
+      </w:r>
+      <w:r>
+        <w:t xml:space="preserve">. Biological Theory, 16(3), 176-193.</w:t>
       </w:r>
       <w:r>
         <w:t xml:space="preserve"> </w:t>
@@ -4256,7 +4264,7 @@
         <w:pStyle w:val="BodyText"/>
       </w:pPr>
       <w:r>
-        <w:t xml:space="preserve">[A20] James C. Faris（1969）.</w:t>
+        <w:t xml:space="preserve">[A19] Per Hage（1997）.</w:t>
       </w:r>
       <w:r>
         <w:t xml:space="preserve"> </w:t>
@@ -4266,10 +4274,10 @@
           <w:i/>
           <w:iCs/>
         </w:rPr>
-        <w:t xml:space="preserve">Sibling Terminology and Cross-Sex Behavior: Data from the Southeastern Nuba Mountains</w:t>
-      </w:r>
-      <w:r>
-        <w:t xml:space="preserve">. American Anthropologist, 71(3), 482-488.</w:t>
+        <w:t xml:space="preserve">Unthinkable Categories and the Fundamental Laws of Kinship</w:t>
+      </w:r>
+      <w:r>
+        <w:t xml:space="preserve">. American Ethnologist, 24(3), 652-667.</w:t>
       </w:r>
       <w:r>
         <w:t xml:space="preserve"> </w:t>
@@ -4291,7 +4299,7 @@
         <w:pStyle w:val="BodyText"/>
       </w:pPr>
       <w:r>
-        <w:t xml:space="preserve">[B01] Charles Kemp, Terry Regier（2012）.</w:t>
+        <w:t xml:space="preserve">[A20] James C. Faris（1969）.</w:t>
       </w:r>
       <w:r>
         <w:t xml:space="preserve"> </w:t>
@@ -4301,10 +4309,10 @@
           <w:i/>
           <w:iCs/>
         </w:rPr>
-        <w:t xml:space="preserve">Kinship Categories Across Languages Reflect General Communicative Principles</w:t>
-      </w:r>
-      <w:r>
-        <w:t xml:space="preserve">. Science, 336(6084), 1049-1054.</w:t>
+        <w:t xml:space="preserve">Sibling Terminology and Cross-Sex Behavior: Data from the Southeastern Nuba Mountains</w:t>
+      </w:r>
+      <w:r>
+        <w:t xml:space="preserve">. American Anthropologist, 71(3), 482-488.</w:t>
       </w:r>
       <w:r>
         <w:t xml:space="preserve"> </w:t>
@@ -4326,7 +4334,7 @@
         <w:pStyle w:val="BodyText"/>
       </w:pPr>
       <w:r>
-        <w:t xml:space="preserve">[B02] Maisy Hallam, Simon Kirby, Fiona Jordan, Kenny Smith（2025）.</w:t>
+        <w:t xml:space="preserve">[B01] Charles Kemp, Terry Regier（2012）.</w:t>
       </w:r>
       <w:r>
         <w:t xml:space="preserve"> </w:t>
@@ -4336,10 +4344,10 @@
           <w:i/>
           <w:iCs/>
         </w:rPr>
-        <w:t xml:space="preserve">Efficient communication drives the semantic structure of kinship terminology</w:t>
-      </w:r>
-      <w:r>
-        <w:t xml:space="preserve">. Proceedings of the Annual Meeting of the Cognitive Science Society, 47(0), 5831-5837.</w:t>
+        <w:t xml:space="preserve">Kinship Categories Across Languages Reflect General Communicative Principles</w:t>
+      </w:r>
+      <w:r>
+        <w:t xml:space="preserve">. Science, 336(6084), 1049-1054.</w:t>
       </w:r>
       <w:r>
         <w:t xml:space="preserve"> </w:t>
@@ -4361,7 +4369,7 @@
         <w:pStyle w:val="BodyText"/>
       </w:pPr>
       <w:r>
-        <w:t xml:space="preserve">[B03] Maisy Hallam, Fiona M. Jordan, Simon Kirby, Kenny Smith（2025）.</w:t>
+        <w:t xml:space="preserve">[B02] Maisy Hallam, Simon Kirby, Fiona Jordan, Kenny Smith（2025）.</w:t>
       </w:r>
       <w:r>
         <w:t xml:space="preserve"> </w:t>
@@ -4371,10 +4379,10 @@
           <w:i/>
           <w:iCs/>
         </w:rPr>
-        <w:t xml:space="preserve">Predictive Structure Emerges During the Generalisation of Kin Terms to New Referents</w:t>
-      </w:r>
-      <w:r>
-        <w:t xml:space="preserve">. Open Mind, 9, 1431-1466.</w:t>
+        <w:t xml:space="preserve">Efficient communication drives the semantic structure of kinship terminology</w:t>
+      </w:r>
+      <w:r>
+        <w:t xml:space="preserve">. Proceedings of the Annual Meeting of the Cognitive Science Society, 47(0), 5831-5837.</w:t>
       </w:r>
       <w:r>
         <w:t xml:space="preserve"> </w:t>
@@ -4396,7 +4404,7 @@
         <w:pStyle w:val="BodyText"/>
       </w:pPr>
       <w:r>
-        <w:t xml:space="preserve">[B04] Charles Kemp（2026）.</w:t>
+        <w:t xml:space="preserve">[B03] Maisy Hallam, Fiona M. Jordan, Simon Kirby, Kenny Smith（2025）.</w:t>
       </w:r>
       <w:r>
         <w:t xml:space="preserve"> </w:t>
@@ -4406,10 +4414,10 @@
           <w:i/>
           <w:iCs/>
         </w:rPr>
-        <w:t xml:space="preserve">Symmetry in category systems across languages</w:t>
-      </w:r>
-      <w:r>
-        <w:t xml:space="preserve">. Nature Communications, 17(1), 358.</w:t>
+        <w:t xml:space="preserve">Predictive Structure Emerges During the Generalisation of Kin Terms to New Referents</w:t>
+      </w:r>
+      <w:r>
+        <w:t xml:space="preserve">. Open Mind, 9, 1431-1466.</w:t>
       </w:r>
       <w:r>
         <w:t xml:space="preserve"> </w:t>
@@ -4431,7 +4439,7 @@
         <w:pStyle w:val="BodyText"/>
       </w:pPr>
       <w:r>
-        <w:t xml:space="preserve">[B05] Charles Kemp, Yang Xu, Terry Regier（2018）.</w:t>
+        <w:t xml:space="preserve">[B04] Charles Kemp（2026）.</w:t>
       </w:r>
       <w:r>
         <w:t xml:space="preserve"> </w:t>
@@ -4441,10 +4449,10 @@
           <w:i/>
           <w:iCs/>
         </w:rPr>
-        <w:t xml:space="preserve">Semantic Typology and Efficient Communication</w:t>
-      </w:r>
-      <w:r>
-        <w:t xml:space="preserve">. Annual Review of Linguistics, 4(1), 109-128.</w:t>
+        <w:t xml:space="preserve">Symmetry in category systems across languages</w:t>
+      </w:r>
+      <w:r>
+        <w:t xml:space="preserve">. Nature Communications, 17(1), 358.</w:t>
       </w:r>
       <w:r>
         <w:t xml:space="preserve"> </w:t>
@@ -4466,7 +4474,7 @@
         <w:pStyle w:val="BodyText"/>
       </w:pPr>
       <w:r>
-        <w:t xml:space="preserve">[B06] Noga Zaslavsky, Charles Kemp, Terry Regier, Naftali Tishby（2018）.</w:t>
+        <w:t xml:space="preserve">[B05] Charles Kemp, Yang Xu, Terry Regier（2018）.</w:t>
       </w:r>
       <w:r>
         <w:t xml:space="preserve"> </w:t>
@@ -4476,10 +4484,10 @@
           <w:i/>
           <w:iCs/>
         </w:rPr>
-        <w:t xml:space="preserve">Efficient compression in color naming and its evolution</w:t>
-      </w:r>
-      <w:r>
-        <w:t xml:space="preserve">. Proceedings of the National Academy of Sciences, 115(31), 7937-7942.</w:t>
+        <w:t xml:space="preserve">Semantic Typology and Efficient Communication</w:t>
+      </w:r>
+      <w:r>
+        <w:t xml:space="preserve">. Annual Review of Linguistics, 4(1), 109-128.</w:t>
       </w:r>
       <w:r>
         <w:t xml:space="preserve"> </w:t>
@@ -4501,7 +4509,7 @@
         <w:pStyle w:val="BodyText"/>
       </w:pPr>
       <w:r>
-        <w:t xml:space="preserve">[B07] Terry Regier, Charles Kemp, Paul Kay（2015）.</w:t>
+        <w:t xml:space="preserve">[B06] Noga Zaslavsky, Charles Kemp, Terry Regier, Naftali Tishby（2018）.</w:t>
       </w:r>
       <w:r>
         <w:t xml:space="preserve"> </w:t>
@@ -4511,10 +4519,10 @@
           <w:i/>
           <w:iCs/>
         </w:rPr>
-        <w:t xml:space="preserve">Word Meanings across Languages Support Efficient Communication</w:t>
-      </w:r>
-      <w:r>
-        <w:t xml:space="preserve">. The Handbook of Language Emergence, 237-263.</w:t>
+        <w:t xml:space="preserve">Efficient compression in color naming and its evolution</w:t>
+      </w:r>
+      <w:r>
+        <w:t xml:space="preserve">. Proceedings of the National Academy of Sciences, 115(31), 7937-7942.</w:t>
       </w:r>
       <w:r>
         <w:t xml:space="preserve"> </w:t>
@@ -4536,7 +4544,7 @@
         <w:pStyle w:val="BodyText"/>
       </w:pPr>
       <w:r>
-        <w:t xml:space="preserve">[B08] Terry Regier, Paul Kay, Naveen Khetarpal（2007）.</w:t>
+        <w:t xml:space="preserve">[B07] Terry Regier, Charles Kemp, Paul Kay（2015）.</w:t>
       </w:r>
       <w:r>
         <w:t xml:space="preserve"> </w:t>
@@ -4546,10 +4554,10 @@
           <w:i/>
           <w:iCs/>
         </w:rPr>
-        <w:t xml:space="preserve">Color naming reflects optimal partitions of color space</w:t>
-      </w:r>
-      <w:r>
-        <w:t xml:space="preserve">. Proceedings of the National Academy of Sciences, 104(4), 1436-1441.</w:t>
+        <w:t xml:space="preserve">Word Meanings across Languages Support Efficient Communication</w:t>
+      </w:r>
+      <w:r>
+        <w:t xml:space="preserve">. The Handbook of Language Emergence, 237-263.</w:t>
       </w:r>
       <w:r>
         <w:t xml:space="preserve"> </w:t>
@@ -4571,7 +4579,7 @@
         <w:pStyle w:val="BodyText"/>
       </w:pPr>
       <w:r>
-        <w:t xml:space="preserve">[B09] Yang Xu, Emmy Liu, Terry Regier（2020）.</w:t>
+        <w:t xml:space="preserve">[B08] Terry Regier, Paul Kay, Naveen Khetarpal（2007）.</w:t>
       </w:r>
       <w:r>
         <w:t xml:space="preserve"> </w:t>
@@ -4581,10 +4589,10 @@
           <w:i/>
           <w:iCs/>
         </w:rPr>
-        <w:t xml:space="preserve">Numeral Systems Across Languages Support Efficient Communication: From Approximate Numerosity to Recursion</w:t>
-      </w:r>
-      <w:r>
-        <w:t xml:space="preserve">. Open Mind, 4, 57-70.</w:t>
+        <w:t xml:space="preserve">Color naming reflects optimal partitions of color space</w:t>
+      </w:r>
+      <w:r>
+        <w:t xml:space="preserve">. Proceedings of the National Academy of Sciences, 104(4), 1436-1441.</w:t>
       </w:r>
       <w:r>
         <w:t xml:space="preserve"> </w:t>
@@ -4606,7 +4614,7 @@
         <w:pStyle w:val="BodyText"/>
       </w:pPr>
       <w:r>
-        <w:t xml:space="preserve">[B10] Charles Kemp（2012）.</w:t>
+        <w:t xml:space="preserve">[B09] Yang Xu, Emmy Liu, Terry Regier（2020）.</w:t>
       </w:r>
       <w:r>
         <w:t xml:space="preserve"> </w:t>
@@ -4616,10 +4624,10 @@
           <w:i/>
           <w:iCs/>
         </w:rPr>
-        <w:t xml:space="preserve">Exploring the conceptual universe</w:t>
-      </w:r>
-      <w:r>
-        <w:t xml:space="preserve">. Psychological Review, 119(4), 685-722.</w:t>
+        <w:t xml:space="preserve">Numeral Systems Across Languages Support Efficient Communication: From Approximate Numerosity to Recursion</w:t>
+      </w:r>
+      <w:r>
+        <w:t xml:space="preserve">. Open Mind, 4, 57-70.</w:t>
       </w:r>
       <w:r>
         <w:t xml:space="preserve"> </w:t>
@@ -4641,7 +4649,7 @@
         <w:pStyle w:val="BodyText"/>
       </w:pPr>
       <w:r>
-        <w:t xml:space="preserve">[B11] Edward Gibson, Richard Futrell, Julian Jara-Ettinger, Kyle Mahowald, Leon Bergen, Sivalogeswaran Ratnasingam, Mitchell Gibson, Steven T. Piantadosi, Bevil R. Conway（2017）.</w:t>
+        <w:t xml:space="preserve">[B10] Charles Kemp（2012）.</w:t>
       </w:r>
       <w:r>
         <w:t xml:space="preserve"> </w:t>
@@ -4651,10 +4659,10 @@
           <w:i/>
           <w:iCs/>
         </w:rPr>
-        <w:t xml:space="preserve">Color naming across languages reflects color use</w:t>
-      </w:r>
-      <w:r>
-        <w:t xml:space="preserve">. Proceedings of the National Academy of Sciences, 114(40), 10785-10790.</w:t>
+        <w:t xml:space="preserve">Exploring the conceptual universe</w:t>
+      </w:r>
+      <w:r>
+        <w:t xml:space="preserve">. Psychological Review, 119(4), 685-722.</w:t>
       </w:r>
       <w:r>
         <w:t xml:space="preserve"> </w:t>
@@ -4676,7 +4684,7 @@
         <w:pStyle w:val="BodyText"/>
       </w:pPr>
       <w:r>
-        <w:t xml:space="preserve">[B12] Jon W. Carr, Kenny Smith, Jennifer Culbertson, Simon Kirby（2020）.</w:t>
+        <w:t xml:space="preserve">[B11] Edward Gibson, Richard Futrell, Julian Jara-Ettinger, Kyle Mahowald, Leon Bergen, Sivalogeswaran Ratnasingam, Mitchell Gibson, Steven T. Piantadosi, Bevil R. Conway（2017）.</w:t>
       </w:r>
       <w:r>
         <w:t xml:space="preserve"> </w:t>
@@ -4686,10 +4694,10 @@
           <w:i/>
           <w:iCs/>
         </w:rPr>
-        <w:t xml:space="preserve">Simplicity and informativeness in semantic category systems</w:t>
-      </w:r>
-      <w:r>
-        <w:t xml:space="preserve">. Cognition, 202, 104289.</w:t>
+        <w:t xml:space="preserve">Color naming across languages reflects color use</w:t>
+      </w:r>
+      <w:r>
+        <w:t xml:space="preserve">. Proceedings of the National Academy of Sciences, 114(40), 10785-10790.</w:t>
       </w:r>
       <w:r>
         <w:t xml:space="preserve"> </w:t>
@@ -4711,7 +4719,7 @@
         <w:pStyle w:val="BodyText"/>
       </w:pPr>
       <w:r>
-        <w:t xml:space="preserve">[B13] Jennifer Culbertson, Simon Kirby（2016）.</w:t>
+        <w:t xml:space="preserve">[B12] Jon W. Carr, Kenny Smith, Jennifer Culbertson, Simon Kirby（2020）.</w:t>
       </w:r>
       <w:r>
         <w:t xml:space="preserve"> </w:t>
@@ -4721,10 +4729,10 @@
           <w:i/>
           <w:iCs/>
         </w:rPr>
-        <w:t xml:space="preserve">Simplicity and Specificity in Language: Domain-General Biases Have Domain-Specific Effects</w:t>
-      </w:r>
-      <w:r>
-        <w:t xml:space="preserve">. Frontiers in Psychology, 6, 1964.</w:t>
+        <w:t xml:space="preserve">Simplicity and informativeness in semantic category systems</w:t>
+      </w:r>
+      <w:r>
+        <w:t xml:space="preserve">. Cognition, 202, 104289.</w:t>
       </w:r>
       <w:r>
         <w:t xml:space="preserve"> </w:t>
@@ -4746,7 +4754,7 @@
         <w:pStyle w:val="BodyText"/>
       </w:pPr>
       <w:r>
-        <w:t xml:space="preserve">[B14] Francis Mollica, Steven T. Piantadosi（2022）.</w:t>
+        <w:t xml:space="preserve">[B13] Jennifer Culbertson, Simon Kirby（2016）.</w:t>
       </w:r>
       <w:r>
         <w:t xml:space="preserve"> </w:t>
@@ -4756,10 +4764,10 @@
           <w:i/>
           <w:iCs/>
         </w:rPr>
-        <w:t xml:space="preserve">Logical word learning: The case of kinship</w:t>
-      </w:r>
-      <w:r>
-        <w:t xml:space="preserve">. Psychonomic Bulletin &amp; Review, 29(3), 766-799.</w:t>
+        <w:t xml:space="preserve">Simplicity and Specificity in Language: Domain-General Biases Have Domain-Specific Effects</w:t>
+      </w:r>
+      <w:r>
+        <w:t xml:space="preserve">. Frontiers in Psychology, 6, 1964.</w:t>
       </w:r>
       <w:r>
         <w:t xml:space="preserve"> </w:t>
@@ -4781,7 +4789,7 @@
         <w:pStyle w:val="BodyText"/>
       </w:pPr>
       <w:r>
-        <w:t xml:space="preserve">[B15] Francis Mollica, Geoff Bacon, Noga Zaslavsky, Yang Xu, Terry Regier, Charles Kemp（2021）.</w:t>
+        <w:t xml:space="preserve">[B14] Francis Mollica, Steven T. Piantadosi（2022）.</w:t>
       </w:r>
       <w:r>
         <w:t xml:space="preserve"> </w:t>
@@ -4791,10 +4799,10 @@
           <w:i/>
           <w:iCs/>
         </w:rPr>
-        <w:t xml:space="preserve">The forms and meanings of grammatical markers support efficient communication</w:t>
-      </w:r>
-      <w:r>
-        <w:t xml:space="preserve">. Proceedings of the National Academy of Sciences, 118(49), e2025993118.</w:t>
+        <w:t xml:space="preserve">Logical word learning: The case of kinship</w:t>
+      </w:r>
+      <w:r>
+        <w:t xml:space="preserve">. Psychonomic Bulletin &amp; Review, 29(3), 766-799.</w:t>
       </w:r>
       <w:r>
         <w:t xml:space="preserve"> </w:t>
@@ -4816,7 +4824,7 @@
         <w:pStyle w:val="BodyText"/>
       </w:pPr>
       <w:r>
-        <w:t xml:space="preserve">[B16] Noga Zaslavsky, Charles Kemp, Naftali Tishby, Terry Regier（2019）.</w:t>
+        <w:t xml:space="preserve">[B15] Francis Mollica, Geoff Bacon, Noga Zaslavsky, Yang Xu, Terry Regier, Charles Kemp（2021）.</w:t>
       </w:r>
       <w:r>
         <w:t xml:space="preserve"> </w:t>
@@ -4826,10 +4834,10 @@
           <w:i/>
           <w:iCs/>
         </w:rPr>
-        <w:t xml:space="preserve">Color Naming Reflects Both Perceptual Structure and Communicative Need</w:t>
-      </w:r>
-      <w:r>
-        <w:t xml:space="preserve">. Topics in Cognitive Science, 11(1), 207-219.</w:t>
+        <w:t xml:space="preserve">The forms and meanings of grammatical markers support efficient communication</w:t>
+      </w:r>
+      <w:r>
+        <w:t xml:space="preserve">. Proceedings of the National Academy of Sciences, 118(49), e2025993118.</w:t>
       </w:r>
       <w:r>
         <w:t xml:space="preserve"> </w:t>
@@ -4851,7 +4859,7 @@
         <w:pStyle w:val="BodyText"/>
       </w:pPr>
       <w:r>
-        <w:t xml:space="preserve">[C01] T. Florian Jaeger（2008）.</w:t>
+        <w:t xml:space="preserve">[B16] Noga Zaslavsky, Charles Kemp, Naftali Tishby, Terry Regier（2019）.</w:t>
       </w:r>
       <w:r>
         <w:t xml:space="preserve"> </w:t>
@@ -4861,10 +4869,10 @@
           <w:i/>
           <w:iCs/>
         </w:rPr>
-        <w:t xml:space="preserve">Categorical data analysis: Away from ANOVAs (transformation or not) and towards logit mixed models</w:t>
-      </w:r>
-      <w:r>
-        <w:t xml:space="preserve">. Journal of Memory and Language, 59(4), 434-446.</w:t>
+        <w:t xml:space="preserve">Color Naming Reflects Both Perceptual Structure and Communicative Need</w:t>
+      </w:r>
+      <w:r>
+        <w:t xml:space="preserve">. Topics in Cognitive Science, 11(1), 207-219.</w:t>
       </w:r>
       <w:r>
         <w:t xml:space="preserve"> </w:t>
@@ -4886,7 +4894,7 @@
         <w:pStyle w:val="BodyText"/>
       </w:pPr>
       <w:r>
-        <w:t xml:space="preserve">[C02] Dale J. Barr, Roger Levy, Christoph Scheepers, Harry J. Tily（2013）.</w:t>
+        <w:t xml:space="preserve">[C01] T. Florian Jaeger（2008）.</w:t>
       </w:r>
       <w:r>
         <w:t xml:space="preserve"> </w:t>
@@ -4896,10 +4904,10 @@
           <w:i/>
           <w:iCs/>
         </w:rPr>
-        <w:t xml:space="preserve">Random effects structure for confirmatory hypothesis testing: Keep it maximal</w:t>
-      </w:r>
-      <w:r>
-        <w:t xml:space="preserve">. Journal of Memory and Language, 68(3), 255-278.</w:t>
+        <w:t xml:space="preserve">Categorical data analysis: Away from ANOVAs (transformation or not) and towards logit mixed models</w:t>
+      </w:r>
+      <w:r>
+        <w:t xml:space="preserve">. Journal of Memory and Language, 59(4), 434-446.</w:t>
       </w:r>
       <w:r>
         <w:t xml:space="preserve"> </w:t>
@@ -4921,7 +4929,7 @@
         <w:pStyle w:val="BodyText"/>
       </w:pPr>
       <w:r>
-        <w:t xml:space="preserve">[C03] Douglas Bates, Martin Mächler, Benjamin M. Bolker, Steven C. Walker（2015）.</w:t>
+        <w:t xml:space="preserve">[C02] Dale J. Barr, Roger Levy, Christoph Scheepers, Harry J. Tily（2013）.</w:t>
       </w:r>
       <w:r>
         <w:t xml:space="preserve"> </w:t>
@@ -4931,10 +4939,10 @@
           <w:i/>
           <w:iCs/>
         </w:rPr>
-        <w:t xml:space="preserve">Fitting Linear Mixed-Effects Models Using lme4</w:t>
-      </w:r>
-      <w:r>
-        <w:t xml:space="preserve">. Journal of Statistical Software, 67(1).</w:t>
+        <w:t xml:space="preserve">Random effects structure for confirmatory hypothesis testing: Keep it maximal</w:t>
+      </w:r>
+      <w:r>
+        <w:t xml:space="preserve">. Journal of Memory and Language, 68(3), 255-278.</w:t>
       </w:r>
       <w:r>
         <w:t xml:space="preserve"> </w:t>
@@ -4956,7 +4964,7 @@
         <w:pStyle w:val="BodyText"/>
       </w:pPr>
       <w:r>
-        <w:t xml:space="preserve">[C04] David R. Roberts, Volker Bahn, Simone Ciuti, Mark S. Boyce, Jane Elith, Gurutzeta Guillera‐Arroita, Severin Hauenstein, José J. Lahoz‐Monfort, Boris Schröder, Wilfried Thuiller, David I. Warton, Brendan A. Wintle, Florian Hartig, Carsten F. Dormann（2017）.</w:t>
+        <w:t xml:space="preserve">[C03] Douglas Bates, Martin Mächler, Benjamin M. Bolker, Steven C. Walker（2015）.</w:t>
       </w:r>
       <w:r>
         <w:t xml:space="preserve"> </w:t>
@@ -4966,10 +4974,10 @@
           <w:i/>
           <w:iCs/>
         </w:rPr>
-        <w:t xml:space="preserve">Cross‐validation strategies for data with temporal, spatial, hierarchical, or phylogenetic structure</w:t>
-      </w:r>
-      <w:r>
-        <w:t xml:space="preserve">. Ecography, 40(8), 913-929.</w:t>
+        <w:t xml:space="preserve">Fitting Linear Mixed-Effects Models Using lme4</w:t>
+      </w:r>
+      <w:r>
+        <w:t xml:space="preserve">. Journal of Statistical Software, 67(1).</w:t>
       </w:r>
       <w:r>
         <w:t xml:space="preserve"> </w:t>
@@ -4991,7 +4999,7 @@
         <w:pStyle w:val="BodyText"/>
       </w:pPr>
       <w:r>
-        <w:t xml:space="preserve">[C05] Andrew Gelman, Aleks Jakulin, Maria Grazia Pittau, Yu-Sung Su（2008）.</w:t>
+        <w:t xml:space="preserve">[C04] David R. Roberts, Volker Bahn, Simone Ciuti, Mark S. Boyce, Jane Elith, Gurutzeta Guillera‐Arroita, Severin Hauenstein, José J. Lahoz‐Monfort, Boris Schröder, Wilfried Thuiller, David I. Warton, Brendan A. Wintle, Florian Hartig, Carsten F. Dormann（2017）.</w:t>
       </w:r>
       <w:r>
         <w:t xml:space="preserve"> </w:t>
@@ -5001,10 +5009,10 @@
           <w:i/>
           <w:iCs/>
         </w:rPr>
-        <w:t xml:space="preserve">A weakly informative default prior distribution for logistic and other regression models</w:t>
-      </w:r>
-      <w:r>
-        <w:t xml:space="preserve">. The Annals of Applied Statistics, 2(4), 1360-1383.</w:t>
+        <w:t xml:space="preserve">Cross‐validation strategies for data with temporal, spatial, hierarchical, or phylogenetic structure</w:t>
+      </w:r>
+      <w:r>
+        <w:t xml:space="preserve">. Ecography, 40(8), 913-929.</w:t>
       </w:r>
       <w:r>
         <w:t xml:space="preserve"> </w:t>
@@ -5026,7 +5034,7 @@
         <w:pStyle w:val="BodyText"/>
       </w:pPr>
       <w:r>
-        <w:t xml:space="preserve">[C06] David Firth（1993）.</w:t>
+        <w:t xml:space="preserve">[C05] Andrew Gelman, Aleks Jakulin, Maria Grazia Pittau, Yu-Sung Su（2008）.</w:t>
       </w:r>
       <w:r>
         <w:t xml:space="preserve"> </w:t>
@@ -5036,10 +5044,10 @@
           <w:i/>
           <w:iCs/>
         </w:rPr>
-        <w:t xml:space="preserve">Bias reduction of maximum likelihood estimates</w:t>
-      </w:r>
-      <w:r>
-        <w:t xml:space="preserve">. Biometrika, 80(1), 27-38.</w:t>
+        <w:t xml:space="preserve">A weakly informative default prior distribution for logistic and other regression models</w:t>
+      </w:r>
+      <w:r>
+        <w:t xml:space="preserve">. The Annals of Applied Statistics, 2(4), 1360-1383.</w:t>
       </w:r>
       <w:r>
         <w:t xml:space="preserve"> </w:t>
@@ -5061,7 +5069,7 @@
         <w:pStyle w:val="BodyText"/>
       </w:pPr>
       <w:r>
-        <w:t xml:space="preserve">[C07] Yoav Benjamini, Yosef Hochberg（1995）.</w:t>
+        <w:t xml:space="preserve">[C06] David Firth（1993）.</w:t>
       </w:r>
       <w:r>
         <w:t xml:space="preserve"> </w:t>
@@ -5071,10 +5079,10 @@
           <w:i/>
           <w:iCs/>
         </w:rPr>
-        <w:t xml:space="preserve">Controlling the False Discovery Rate: A Practical and Powerful Approach to Multiple Testing</w:t>
-      </w:r>
-      <w:r>
-        <w:t xml:space="preserve">. Journal of the Royal Statistical Society Series B: Statistical Methodology, 57(1), 289-300.</w:t>
+        <w:t xml:space="preserve">Bias reduction of maximum likelihood estimates</w:t>
+      </w:r>
+      <w:r>
+        <w:t xml:space="preserve">. Biometrika, 80(1), 27-38.</w:t>
       </w:r>
       <w:r>
         <w:t xml:space="preserve"> </w:t>
@@ -5096,7 +5104,7 @@
         <w:pStyle w:val="BodyText"/>
       </w:pPr>
       <w:r>
-        <w:t xml:space="preserve">[C08] T. Florian Jaeger, Peter Graff, William Croft, Daniel Pontillo（2011）.</w:t>
+        <w:t xml:space="preserve">[C07] Yoav Benjamini, Yosef Hochberg（1995）.</w:t>
       </w:r>
       <w:r>
         <w:t xml:space="preserve"> </w:t>
@@ -5106,10 +5114,10 @@
           <w:i/>
           <w:iCs/>
         </w:rPr>
-        <w:t xml:space="preserve">Mixed effect models for genetic and areal dependencies in linguistic typology</w:t>
-      </w:r>
-      <w:r>
-        <w:t xml:space="preserve">. Linguistic Typology, 15(2), 281–320.</w:t>
+        <w:t xml:space="preserve">Controlling the False Discovery Rate: A Practical and Powerful Approach to Multiple Testing</w:t>
+      </w:r>
+      <w:r>
+        <w:t xml:space="preserve">. Journal of the Royal Statistical Society Series B: Statistical Methodology, 57(1), 289-300.</w:t>
       </w:r>
       <w:r>
         <w:t xml:space="preserve"> </w:t>
@@ -5131,7 +5139,7 @@
         <w:pStyle w:val="BodyText"/>
       </w:pPr>
       <w:r>
-        <w:t xml:space="preserve">[C09] Michael Dunn, Simon J. Greenhill, Stephen C. Levinson, Russell D. Gray（2011）.</w:t>
+        <w:t xml:space="preserve">[C08] T. Florian Jaeger, Peter Graff, William Croft, Daniel Pontillo（2011）.</w:t>
       </w:r>
       <w:r>
         <w:t xml:space="preserve"> </w:t>
@@ -5141,10 +5149,10 @@
           <w:i/>
           <w:iCs/>
         </w:rPr>
-        <w:t xml:space="preserve">Evolved structure of language shows lineage-specific trends in word-order universals</w:t>
-      </w:r>
-      <w:r>
-        <w:t xml:space="preserve">. Nature, 473(7345), 79-82.</w:t>
+        <w:t xml:space="preserve">Mixed effect models for genetic and areal dependencies in linguistic typology</w:t>
+      </w:r>
+      <w:r>
+        <w:t xml:space="preserve">. Linguistic Typology, 15(2), 281–320.</w:t>
       </w:r>
       <w:r>
         <w:t xml:space="preserve"> </w:t>
@@ -5166,7 +5174,7 @@
         <w:pStyle w:val="BodyText"/>
       </w:pPr>
       <w:r>
-        <w:t xml:space="preserve">[C10] Kathryn R. Kirby, Russell D. Gray, Simon J. Greenhill, Fiona M. Jordan, Stephanie Gomes-Ng, Hans-Jörg Bibiko, Damián E. Blasi, Carlos A. Botero, Claire Bowern, Carol R. Ember, Dan Leehr, Bobbi S. Low, Joe McCarter, William Divale, Michael C. Gavin（2016）.</w:t>
+        <w:t xml:space="preserve">[C09] Michael Dunn, Simon J. Greenhill, Stephen C. Levinson, Russell D. Gray（2011）.</w:t>
       </w:r>
       <w:r>
         <w:t xml:space="preserve"> </w:t>
@@ -5176,10 +5184,10 @@
           <w:i/>
           <w:iCs/>
         </w:rPr>
-        <w:t xml:space="preserve">D-PLACE: A Global Database of Cultural, Linguistic and Environmental Diversity</w:t>
-      </w:r>
-      <w:r>
-        <w:t xml:space="preserve">. PLOS ONE, 11(7), e0158391.</w:t>
+        <w:t xml:space="preserve">Evolved structure of language shows lineage-specific trends in word-order universals</w:t>
+      </w:r>
+      <w:r>
+        <w:t xml:space="preserve">. Nature, 473(7345), 79-82.</w:t>
       </w:r>
       <w:r>
         <w:t xml:space="preserve"> </w:t>
@@ -5201,7 +5209,7 @@
         <w:pStyle w:val="BodyText"/>
       </w:pPr>
       <w:r>
-        <w:t xml:space="preserve">[C11] Robert Forkel, Johann-Mattis List, Simon J. Greenhill, Christoph Rzymski, Sebastian Bank, Michael Cysouw, Harald Hammarström, Martin Haspelmath, Gereon A. Kaiping, Russell D. Gray（2018）.</w:t>
+        <w:t xml:space="preserve">[C10] Kathryn R. Kirby, Russell D. Gray, Simon J. Greenhill, Fiona M. Jordan, Stephanie Gomes-Ng, Hans-Jörg Bibiko, Damián E. Blasi, Carlos A. Botero, Claire Bowern, Carol R. Ember, Dan Leehr, Bobbi S. Low, Joe McCarter, William Divale, Michael C. Gavin（2016）.</w:t>
       </w:r>
       <w:r>
         <w:t xml:space="preserve"> </w:t>
@@ -5211,10 +5219,10 @@
           <w:i/>
           <w:iCs/>
         </w:rPr>
-        <w:t xml:space="preserve">Cross-Linguistic Data Formats, advancing data sharing and re-use in comparative linguistics</w:t>
-      </w:r>
-      <w:r>
-        <w:t xml:space="preserve">. Scientific Data, 5(1), 180205.</w:t>
+        <w:t xml:space="preserve">D-PLACE: A Global Database of Cultural, Linguistic and Environmental Diversity</w:t>
+      </w:r>
+      <w:r>
+        <w:t xml:space="preserve">. PLOS ONE, 11(7), e0158391.</w:t>
       </w:r>
       <w:r>
         <w:t xml:space="preserve"> </w:t>
@@ -5236,7 +5244,7 @@
         <w:pStyle w:val="BodyText"/>
       </w:pPr>
       <w:r>
-        <w:t xml:space="preserve">[C12] A. Colin Cameron, Jonah B. Gelbach, Douglas L. Miller（2008）.</w:t>
+        <w:t xml:space="preserve">[C11] Robert Forkel, Johann-Mattis List, Simon J. Greenhill, Christoph Rzymski, Sebastian Bank, Michael Cysouw, Harald Hammarström, Martin Haspelmath, Gereon A. Kaiping, Russell D. Gray（2018）.</w:t>
       </w:r>
       <w:r>
         <w:t xml:space="preserve"> </w:t>
@@ -5246,10 +5254,10 @@
           <w:i/>
           <w:iCs/>
         </w:rPr>
-        <w:t xml:space="preserve">Bootstrap-Based Improvements for Inference with Clustered Errors</w:t>
-      </w:r>
-      <w:r>
-        <w:t xml:space="preserve">. Review of Economics and Statistics, 90(3), 414-427.</w:t>
+        <w:t xml:space="preserve">Cross-Linguistic Data Formats, advancing data sharing and re-use in comparative linguistics</w:t>
+      </w:r>
+      <w:r>
+        <w:t xml:space="preserve">. Scientific Data, 5(1), 180205.</w:t>
       </w:r>
       <w:r>
         <w:t xml:space="preserve"> </w:t>
@@ -5266,29 +5274,12 @@
         <w:t xml:space="preserve">。</w:t>
       </w:r>
     </w:p>
-    <w:bookmarkStart w:id="86" w:name="补充历史资料首段预览"/>
-    <w:p>
-      <w:pPr>
-        <w:pStyle w:val="Heading3"/>
-      </w:pPr>
-      <w:r>
-        <w:t xml:space="preserve">补充历史资料：首段预览</w:t>
-      </w:r>
-    </w:p>
-    <w:p>
-      <w:pPr>
-        <w:pStyle w:val="FirstParagraph"/>
-      </w:pPr>
-      <w:r>
-        <w:t xml:space="preserve">以下两项保留为历史脉络资料，未计入45份全文／真实摘要文献。</w:t>
-      </w:r>
-    </w:p>
     <w:p>
       <w:pPr>
         <w:pStyle w:val="BodyText"/>
       </w:pPr>
       <w:r>
-        <w:t xml:space="preserve">[A03] Ward H. Goodenough（1956）.</w:t>
+        <w:t xml:space="preserve">[C12] A. Colin Cameron, Jonah B. Gelbach, Douglas L. Miller（2008）.</w:t>
       </w:r>
       <w:r>
         <w:t xml:space="preserve"> </w:t>
@@ -5298,10 +5289,10 @@
           <w:i/>
           <w:iCs/>
         </w:rPr>
-        <w:t xml:space="preserve">Componential Analysis and the Study of Meaning</w:t>
-      </w:r>
-      <w:r>
-        <w:t xml:space="preserve">. Language, 32(1), 195-216.</w:t>
+        <w:t xml:space="preserve">Bootstrap-Based Improvements for Inference with Clustered Errors</w:t>
+      </w:r>
+      <w:r>
+        <w:t xml:space="preserve">. Review of Economics and Statistics, 90(3), 414-427.</w:t>
       </w:r>
       <w:r>
         <w:t xml:space="preserve"> </w:t>
@@ -5315,47 +5306,11 @@
         </w:r>
       </w:hyperlink>
       <w:r>
-        <w:t xml:space="preserve">。 出版商首段预览；不计正式全文／摘要阅读。</w:t>
-      </w:r>
-    </w:p>
-    <w:p>
-      <w:pPr>
-        <w:pStyle w:val="BodyText"/>
-      </w:pPr>
-      <w:r>
-        <w:t xml:space="preserve">[A04] Floyd G. Lounsbury（1956）.</w:t>
-      </w:r>
-      <w:r>
-        <w:t xml:space="preserve"> </w:t>
-      </w:r>
-      <w:r>
-        <w:rPr>
-          <w:i/>
-          <w:iCs/>
-        </w:rPr>
-        <w:t xml:space="preserve">A Semantic Analysis of the Pawnee Kinship Usage</w:t>
-      </w:r>
-      <w:r>
-        <w:t xml:space="preserve">. Language, 32(1), 158-194.</w:t>
-      </w:r>
-      <w:r>
-        <w:t xml:space="preserve"> </w:t>
-      </w:r>
-      <w:hyperlink r:id="rId85">
-        <w:r>
-          <w:rPr>
-            <w:rStyle w:val="Hyperlink"/>
-          </w:rPr>
-          <w:t xml:space="preserve">原始来源</w:t>
-        </w:r>
-      </w:hyperlink>
-      <w:r>
-        <w:t xml:space="preserve">。 出版商首段预览；不计正式全文／摘要阅读。</w:t>
-      </w:r>
-    </w:p>
+        <w:t xml:space="preserve">。</w:t>
+      </w:r>
+    </w:p>
+    <w:bookmarkEnd w:id="85"/>
     <w:bookmarkEnd w:id="86"/>
-    <w:bookmarkEnd w:id="87"/>
-    <w:bookmarkEnd w:id="88"/>
     <w:sectPr>
       <w:pgSz w:h="16838" w:w="11906"/>
       <w:pgMar w:top="1134" w:bottom="1134" w:left="1134" w:right="1134"/>

</xml_diff>